<commit_message>
:bug: fixed instructions for strategy
</commit_message>
<xml_diff>
--- a/Lectures/Lecture16_Mar19/The Strategy Outline Template.docx
+++ b/Lectures/Lecture16_Mar19/The Strategy Outline Template.docx
@@ -685,31 +685,7 @@
         <w:rPr>
           <w:rFonts w:asciiTheme="majorHAnsi" w:hAnsiTheme="majorHAnsi" w:cstheme="majorHAnsi"/>
         </w:rPr>
-        <w:t xml:space="preserve">State why </w:t>
-      </w:r>
-      <w:r>
-        <w:rPr>
-          <w:rFonts w:asciiTheme="majorHAnsi" w:hAnsiTheme="majorHAnsi" w:cstheme="majorHAnsi"/>
-        </w:rPr>
-        <w:t>target leads to the “key component” that</w:t>
-      </w:r>
-      <w:r>
-        <w:rPr>
-          <w:rFonts w:asciiTheme="majorHAnsi" w:hAnsiTheme="majorHAnsi" w:cstheme="majorHAnsi"/>
-        </w:rPr>
-        <w:t xml:space="preserve"> solv</w:t>
-      </w:r>
-      <w:r>
-        <w:rPr>
-          <w:rFonts w:asciiTheme="majorHAnsi" w:hAnsiTheme="majorHAnsi" w:cstheme="majorHAnsi"/>
-        </w:rPr>
-        <w:t>es</w:t>
-      </w:r>
-      <w:r>
-        <w:rPr>
-          <w:rFonts w:asciiTheme="majorHAnsi" w:hAnsiTheme="majorHAnsi" w:cstheme="majorHAnsi"/>
-        </w:rPr>
-        <w:t xml:space="preserve"> the “problem”? </w:t>
+        <w:t>Why this facility? (Why HST/JWST)</w:t>
       </w:r>
     </w:p>
     <w:p>
@@ -740,7 +716,7 @@
         <w:rPr>
           <w:rFonts w:asciiTheme="majorHAnsi" w:hAnsiTheme="majorHAnsi" w:cstheme="majorHAnsi"/>
         </w:rPr>
-        <w:t xml:space="preserve"> (why is it suitable for HST/JWST/facility)</w:t>
+        <w:t xml:space="preserve"> </w:t>
       </w:r>
     </w:p>
     <w:p>
@@ -929,7 +905,7 @@
         </w:rPr>
         <w:lastRenderedPageBreak/>
         <w:drawing>
-          <wp:inline distT="0" distB="0" distL="0" distR="0" wp14:anchorId="1D50932F" wp14:editId="1467656B">
+          <wp:inline distT="0" distB="0" distL="0" distR="0" wp14:anchorId="1D50932F" wp14:editId="30D0ABD0">
             <wp:extent cx="5943600" cy="4626610"/>
             <wp:effectExtent l="0" t="0" r="0" b="0"/>
             <wp:docPr id="27370844" name="Picture 1" descr="A collage of images of a star&#10;&#10;AI-generated content may be incorrect."/>

</xml_diff>